<commit_message>
IOLG-138: Word output readable: reference.docx with 2 cm margins and 9 pt table type, proportional column widths on every wide table
The first Word build set equal column widths and 11 pt type, so the
five-column stage table wrapped code mid-word. The design pages and the
two handover documents now build with scripts/reference.docx, and the
design pages' wide tables carry proportional widths in their separator
rows, which pandoc turns into Word column widths. The stage table's input
and output columns are merged.

Co-Authored-By: Claude Fable 5.1 <noreply@anthropic.com>
</commit_message>
<xml_diff>
--- a/docs/LJA -- Pipeline.docx
+++ b/docs/LJA -- Pipeline.docx
@@ -319,10 +319,10 @@
         <w:tblLook w:firstRow="1" w:lastRow="0" w:firstColumn="0" w:lastColumn="0" w:noHBand="0" w:noVBand="0" w:val="0020"/>
       </w:tblPr>
       <w:tblGrid>
-        <w:gridCol w:w="1980"/>
-        <w:gridCol w:w="1980"/>
-        <w:gridCol w:w="1980"/>
-        <w:gridCol w:w="1980"/>
+        <w:gridCol w:w="990"/>
+        <w:gridCol w:w="1485"/>
+        <w:gridCol w:w="4455"/>
+        <w:gridCol w:w="990"/>
       </w:tblGrid>
       <w:tr>
         <w:trPr>
@@ -813,9 +813,9 @@
         <w:tblLook w:firstRow="1" w:lastRow="0" w:firstColumn="0" w:lastColumn="0" w:noHBand="0" w:noVBand="0" w:val="0020"/>
       </w:tblPr>
       <w:tblGrid>
-        <w:gridCol w:w="2640"/>
-        <w:gridCol w:w="2640"/>
-        <w:gridCol w:w="2640"/>
+        <w:gridCol w:w="2346"/>
+        <w:gridCol w:w="4106"/>
+        <w:gridCol w:w="1466"/>
       </w:tblGrid>
       <w:tr>
         <w:trPr>

</xml_diff>